<commit_message>
bổ sung video cho lab 5
</commit_message>
<xml_diff>
--- a/LAB5/11_ĐH_CNPM2-LAB5_1150080113-ChauThiNgocQuyen.docx
+++ b/LAB5/11_ĐH_CNPM2-LAB5_1150080113-ChauThiNgocQuyen.docx
@@ -168,6 +168,73 @@
           <w:lang w:val="en-US"/>
         </w:rPr>
       </w:pPr>
+      <w:r>
+        <w:rPr>
+          <w:rFonts w:hint="default" w:ascii="Times New Roman" w:hAnsi="Times New Roman" w:cs="Times New Roman"/>
+          <w:sz w:val="26"/>
+          <w:szCs w:val="26"/>
+          <w:lang w:val="en-US"/>
+        </w:rPr>
+        <w:t xml:space="preserve">Video Liên quan - </w:t>
+      </w:r>
+      <w:r>
+        <w:rPr>
+          <w:rFonts w:hint="default" w:ascii="Times New Roman" w:hAnsi="Times New Roman" w:cs="Times New Roman"/>
+          <w:sz w:val="26"/>
+          <w:szCs w:val="26"/>
+          <w:lang w:val="en-US"/>
+        </w:rPr>
+        <w:fldChar w:fldCharType="begin"/>
+      </w:r>
+      <w:r>
+        <w:rPr>
+          <w:rFonts w:hint="default" w:ascii="Times New Roman" w:hAnsi="Times New Roman" w:cs="Times New Roman"/>
+          <w:sz w:val="26"/>
+          <w:szCs w:val="26"/>
+          <w:lang w:val="en-US"/>
+        </w:rPr>
+        <w:instrText xml:space="preserve"> HYPERLINK "https://youtu.be/Ura-XGe0aaY" </w:instrText>
+      </w:r>
+      <w:r>
+        <w:rPr>
+          <w:rFonts w:hint="default" w:ascii="Times New Roman" w:hAnsi="Times New Roman" w:cs="Times New Roman"/>
+          <w:sz w:val="26"/>
+          <w:szCs w:val="26"/>
+          <w:lang w:val="en-US"/>
+        </w:rPr>
+        <w:fldChar w:fldCharType="separate"/>
+      </w:r>
+      <w:r>
+        <w:rPr>
+          <w:rStyle w:val="7"/>
+          <w:rFonts w:hint="default" w:ascii="Times New Roman" w:hAnsi="Times New Roman" w:cs="Times New Roman"/>
+          <w:sz w:val="26"/>
+          <w:szCs w:val="26"/>
+          <w:lang w:val="en-US"/>
+        </w:rPr>
+        <w:t>https://youtu.be/Ura-XGe0aaY</w:t>
+      </w:r>
+      <w:r>
+        <w:rPr>
+          <w:rFonts w:hint="default" w:ascii="Times New Roman" w:hAnsi="Times New Roman" w:cs="Times New Roman"/>
+          <w:sz w:val="26"/>
+          <w:szCs w:val="26"/>
+          <w:lang w:val="en-US"/>
+        </w:rPr>
+        <w:fldChar w:fldCharType="end"/>
+      </w:r>
+    </w:p>
+    <w:p>
+      <w:pPr>
+        <w:spacing w:line="360" w:lineRule="auto"/>
+        <w:jc w:val="center"/>
+        <w:rPr>
+          <w:rFonts w:hint="default" w:ascii="Times New Roman" w:hAnsi="Times New Roman" w:cs="Times New Roman"/>
+          <w:sz w:val="26"/>
+          <w:szCs w:val="26"/>
+          <w:lang w:val="en-US"/>
+        </w:rPr>
+      </w:pPr>
     </w:p>
     <w:p>
       <w:pPr>
@@ -187,29 +254,29 @@
           <w:lang w:val="en-US"/>
         </w:rPr>
         <w:t>Kiểm tra môi trường</w:t>
-      </w:r>
-    </w:p>
-    <w:p>
-      <w:pPr>
-        <w:spacing w:line="360" w:lineRule="auto"/>
-        <w:rPr>
-          <w:rFonts w:hint="default" w:ascii="Times New Roman" w:hAnsi="Times New Roman" w:cs="Times New Roman"/>
-          <w:sz w:val="26"/>
-          <w:szCs w:val="26"/>
-          <w:lang w:val="en-US"/>
-        </w:rPr>
-      </w:pPr>
-      <w:r>
-        <w:rPr>
-          <w:rFonts w:hint="default" w:ascii="Times New Roman" w:hAnsi="Times New Roman" w:cs="Times New Roman"/>
-          <w:sz w:val="26"/>
-          <w:szCs w:val="26"/>
-          <w:lang w:val="en-US"/>
-        </w:rPr>
-        <w:t>Kiểm tra IP trên máy thật</w:t>
       </w:r>
       <w:bookmarkStart w:id="10" w:name="_GoBack"/>
       <w:bookmarkEnd w:id="10"/>
+    </w:p>
+    <w:p>
+      <w:pPr>
+        <w:spacing w:line="360" w:lineRule="auto"/>
+        <w:rPr>
+          <w:rFonts w:hint="default" w:ascii="Times New Roman" w:hAnsi="Times New Roman" w:cs="Times New Roman"/>
+          <w:sz w:val="26"/>
+          <w:szCs w:val="26"/>
+          <w:lang w:val="en-US"/>
+        </w:rPr>
+      </w:pPr>
+      <w:r>
+        <w:rPr>
+          <w:rFonts w:hint="default" w:ascii="Times New Roman" w:hAnsi="Times New Roman" w:cs="Times New Roman"/>
+          <w:sz w:val="26"/>
+          <w:szCs w:val="26"/>
+          <w:lang w:val="en-US"/>
+        </w:rPr>
+        <w:t>Kiểm tra IP trên máy thật</w:t>
+      </w:r>
     </w:p>
     <w:p>
       <w:pPr>

</xml_diff>